<commit_message>
docs: correct API validation wording in DZ1 report
</commit_message>
<xml_diff>
--- a/docs/ДЗ1_Родионов_Сергей_отчёт.docx
+++ b/docs/ДЗ1_Родионов_Сергей_отчёт.docx
@@ -309,7 +309,7 @@
       <w:r>
         <w:fldChar w:fldCharType="separate"/>
       </w:r>
-      <w:hyperlink w:anchor="_Toc242383218" w:history="1">
+      <w:hyperlink w:anchor="_Toc242391847" w:history="1">
         <w:r>
           <w:rPr>
             <w:rStyle w:val="Hyperlink"/>
@@ -337,7 +337,7 @@
             <w:noProof/>
             <w:webHidden/>
           </w:rPr>
-          <w:instrText xml:space="preserve"> PAGEREF _Toc242383218 \h </w:instrText>
+          <w:instrText xml:space="preserve"> PAGEREF _Toc242391847 \h </w:instrText>
         </w:r>
         <w:r>
           <w:rPr>
@@ -382,7 +382,7 @@
           <w:lang w:val="ru-RU" w:eastAsia="ru-RU"/>
         </w:rPr>
       </w:pPr>
-      <w:hyperlink w:anchor="_Toc242383219" w:history="1">
+      <w:hyperlink w:anchor="_Toc242391848" w:history="1">
         <w:r>
           <w:rPr>
             <w:rStyle w:val="Hyperlink"/>
@@ -410,7 +410,7 @@
             <w:noProof/>
             <w:webHidden/>
           </w:rPr>
-          <w:instrText xml:space="preserve"> PAGEREF _Toc242383219 \h </w:instrText>
+          <w:instrText xml:space="preserve"> PAGEREF _Toc242391848 \h </w:instrText>
         </w:r>
         <w:r>
           <w:rPr>
@@ -455,7 +455,7 @@
           <w:lang w:val="ru-RU" w:eastAsia="ru-RU"/>
         </w:rPr>
       </w:pPr>
-      <w:hyperlink w:anchor="_Toc242383220" w:history="1">
+      <w:hyperlink w:anchor="_Toc242391849" w:history="1">
         <w:r>
           <w:rPr>
             <w:rStyle w:val="Hyperlink"/>
@@ -483,7 +483,7 @@
             <w:noProof/>
             <w:webHidden/>
           </w:rPr>
-          <w:instrText xml:space="preserve"> PAGEREF _Toc242383220 \h </w:instrText>
+          <w:instrText xml:space="preserve"> PAGEREF _Toc242391849 \h </w:instrText>
         </w:r>
         <w:r>
           <w:rPr>
@@ -528,7 +528,7 @@
           <w:lang w:val="ru-RU" w:eastAsia="ru-RU"/>
         </w:rPr>
       </w:pPr>
-      <w:hyperlink w:anchor="_Toc242383221" w:history="1">
+      <w:hyperlink w:anchor="_Toc242391850" w:history="1">
         <w:r>
           <w:rPr>
             <w:rStyle w:val="Hyperlink"/>
@@ -556,7 +556,7 @@
             <w:noProof/>
             <w:webHidden/>
           </w:rPr>
-          <w:instrText xml:space="preserve"> PAGEREF _Toc242383221 \h </w:instrText>
+          <w:instrText xml:space="preserve"> PAGEREF _Toc242391850 \h </w:instrText>
         </w:r>
         <w:r>
           <w:rPr>
@@ -601,7 +601,7 @@
           <w:lang w:val="ru-RU" w:eastAsia="ru-RU"/>
         </w:rPr>
       </w:pPr>
-      <w:hyperlink w:anchor="_Toc242383222" w:history="1">
+      <w:hyperlink w:anchor="_Toc242391851" w:history="1">
         <w:r>
           <w:rPr>
             <w:rStyle w:val="Hyperlink"/>
@@ -629,7 +629,7 @@
             <w:noProof/>
             <w:webHidden/>
           </w:rPr>
-          <w:instrText xml:space="preserve"> PAGEREF _Toc242383222 \h </w:instrText>
+          <w:instrText xml:space="preserve"> PAGEREF _Toc242391851 \h </w:instrText>
         </w:r>
         <w:r>
           <w:rPr>
@@ -674,7 +674,7 @@
           <w:lang w:val="ru-RU" w:eastAsia="ru-RU"/>
         </w:rPr>
       </w:pPr>
-      <w:hyperlink w:anchor="_Toc242383223" w:history="1">
+      <w:hyperlink w:anchor="_Toc242391852" w:history="1">
         <w:r>
           <w:rPr>
             <w:rStyle w:val="Hyperlink"/>
@@ -702,7 +702,7 @@
             <w:noProof/>
             <w:webHidden/>
           </w:rPr>
-          <w:instrText xml:space="preserve"> PAGEREF _Toc242383223 \h </w:instrText>
+          <w:instrText xml:space="preserve"> PAGEREF _Toc242391852 \h </w:instrText>
         </w:r>
         <w:r>
           <w:rPr>
@@ -722,7 +722,7 @@
             <w:noProof/>
             <w:webHidden/>
           </w:rPr>
-          <w:t>8</w:t>
+          <w:t>9</w:t>
         </w:r>
         <w:r>
           <w:rPr>
@@ -747,7 +747,7 @@
           <w:lang w:val="ru-RU" w:eastAsia="ru-RU"/>
         </w:rPr>
       </w:pPr>
-      <w:hyperlink w:anchor="_Toc242383224" w:history="1">
+      <w:hyperlink w:anchor="_Toc242391853" w:history="1">
         <w:r>
           <w:rPr>
             <w:rStyle w:val="Hyperlink"/>
@@ -775,7 +775,7 @@
             <w:noProof/>
             <w:webHidden/>
           </w:rPr>
-          <w:instrText xml:space="preserve"> PAGEREF _Toc242383224 \h </w:instrText>
+          <w:instrText xml:space="preserve"> PAGEREF _Toc242391853 \h </w:instrText>
         </w:r>
         <w:r>
           <w:rPr>
@@ -820,7 +820,7 @@
           <w:lang w:val="ru-RU" w:eastAsia="ru-RU"/>
         </w:rPr>
       </w:pPr>
-      <w:hyperlink w:anchor="_Toc242383225" w:history="1">
+      <w:hyperlink w:anchor="_Toc242391854" w:history="1">
         <w:r>
           <w:rPr>
             <w:rStyle w:val="Hyperlink"/>
@@ -848,153 +848,7 @@
             <w:noProof/>
             <w:webHidden/>
           </w:rPr>
-          <w:instrText xml:space="preserve"> PAGEREF _Toc242383225 \h </w:instrText>
-        </w:r>
-        <w:r>
-          <w:rPr>
-            <w:noProof/>
-            <w:webHidden/>
-          </w:rPr>
-        </w:r>
-        <w:r>
-          <w:rPr>
-            <w:noProof/>
-            <w:webHidden/>
-          </w:rPr>
-          <w:fldChar w:fldCharType="separate"/>
-        </w:r>
-        <w:r>
-          <w:rPr>
-            <w:noProof/>
-            <w:webHidden/>
-          </w:rPr>
-          <w:t>10</w:t>
-        </w:r>
-        <w:r>
-          <w:rPr>
-            <w:noProof/>
-            <w:webHidden/>
-          </w:rPr>
-          <w:fldChar w:fldCharType="end"/>
-        </w:r>
-      </w:hyperlink>
-    </w:p>
-    <w:p>
-      <w:pPr>
-        <w:pStyle w:val="TOC2"/>
-        <w:tabs>
-          <w:tab w:val="right" w:leader="dot" w:pos="9679"/>
-        </w:tabs>
-        <w:rPr>
-          <w:rFonts w:asciiTheme="minorHAnsi" w:eastAsiaTheme="minorEastAsia" w:hAnsiTheme="minorHAnsi"/>
-          <w:noProof/>
-          <w:color w:val="auto"/>
-          <w:sz w:val="22"/>
-          <w:lang w:val="ru-RU" w:eastAsia="ru-RU"/>
-        </w:rPr>
-      </w:pPr>
-      <w:hyperlink w:anchor="_Toc242383226" w:history="1">
-        <w:r>
-          <w:rPr>
-            <w:rStyle w:val="Hyperlink"/>
-            <w:rFonts w:eastAsiaTheme="majorEastAsia"/>
-            <w:noProof/>
-          </w:rPr>
-          <w:t>2.1 Время ответа операций</w:t>
-        </w:r>
-        <w:r>
-          <w:rPr>
-            <w:noProof/>
-            <w:webHidden/>
-          </w:rPr>
-          <w:tab/>
-        </w:r>
-        <w:r>
-          <w:rPr>
-            <w:noProof/>
-            <w:webHidden/>
-          </w:rPr>
-          <w:fldChar w:fldCharType="begin"/>
-        </w:r>
-        <w:r>
-          <w:rPr>
-            <w:noProof/>
-            <w:webHidden/>
-          </w:rPr>
-          <w:instrText xml:space="preserve"> PAGEREF _Toc242383226 \h </w:instrText>
-        </w:r>
-        <w:r>
-          <w:rPr>
-            <w:noProof/>
-            <w:webHidden/>
-          </w:rPr>
-        </w:r>
-        <w:r>
-          <w:rPr>
-            <w:noProof/>
-            <w:webHidden/>
-          </w:rPr>
-          <w:fldChar w:fldCharType="separate"/>
-        </w:r>
-        <w:r>
-          <w:rPr>
-            <w:noProof/>
-            <w:webHidden/>
-          </w:rPr>
-          <w:t>10</w:t>
-        </w:r>
-        <w:r>
-          <w:rPr>
-            <w:noProof/>
-            <w:webHidden/>
-          </w:rPr>
-          <w:fldChar w:fldCharType="end"/>
-        </w:r>
-      </w:hyperlink>
-    </w:p>
-    <w:p>
-      <w:pPr>
-        <w:pStyle w:val="TOC2"/>
-        <w:tabs>
-          <w:tab w:val="right" w:leader="dot" w:pos="9679"/>
-        </w:tabs>
-        <w:rPr>
-          <w:rFonts w:asciiTheme="minorHAnsi" w:eastAsiaTheme="minorEastAsia" w:hAnsiTheme="minorHAnsi"/>
-          <w:noProof/>
-          <w:color w:val="auto"/>
-          <w:sz w:val="22"/>
-          <w:lang w:val="ru-RU" w:eastAsia="ru-RU"/>
-        </w:rPr>
-      </w:pPr>
-      <w:hyperlink w:anchor="_Toc242383227" w:history="1">
-        <w:r>
-          <w:rPr>
-            <w:rStyle w:val="Hyperlink"/>
-            <w:rFonts w:eastAsiaTheme="majorEastAsia"/>
-            <w:noProof/>
-          </w:rPr>
-          <w:t>2.2 Разложение времени между приложением и базой данных</w:t>
-        </w:r>
-        <w:r>
-          <w:rPr>
-            <w:noProof/>
-            <w:webHidden/>
-          </w:rPr>
-          <w:tab/>
-        </w:r>
-        <w:r>
-          <w:rPr>
-            <w:noProof/>
-            <w:webHidden/>
-          </w:rPr>
-          <w:fldChar w:fldCharType="begin"/>
-        </w:r>
-        <w:r>
-          <w:rPr>
-            <w:noProof/>
-            <w:webHidden/>
-          </w:rPr>
-          <w:instrText xml:space="preserve"> PAGEREF _Toc242383227 \h </w:instrText>
+          <w:instrText xml:space="preserve"> PAGEREF _Toc242391854 \h </w:instrText>
         </w:r>
         <w:r>
           <w:rPr>
@@ -1027,7 +881,7 @@
     </w:p>
     <w:p>
       <w:pPr>
-        <w:pStyle w:val="TOC1"/>
+        <w:pStyle w:val="TOC2"/>
         <w:tabs>
           <w:tab w:val="right" w:leader="dot" w:pos="9679"/>
         </w:tabs>
@@ -1039,14 +893,14 @@
           <w:lang w:val="ru-RU" w:eastAsia="ru-RU"/>
         </w:rPr>
       </w:pPr>
-      <w:hyperlink w:anchor="_Toc242383228" w:history="1">
+      <w:hyperlink w:anchor="_Toc242391855" w:history="1">
         <w:r>
           <w:rPr>
             <w:rStyle w:val="Hyperlink"/>
             <w:rFonts w:eastAsiaTheme="majorEastAsia"/>
             <w:noProof/>
           </w:rPr>
-          <w:t>3 Гипотезы об узких местах</w:t>
+          <w:t>2.1 Время ответа операций</w:t>
         </w:r>
         <w:r>
           <w:rPr>
@@ -1067,7 +921,80 @@
             <w:noProof/>
             <w:webHidden/>
           </w:rPr>
-          <w:instrText xml:space="preserve"> PAGEREF _Toc242383228 \h </w:instrText>
+          <w:instrText xml:space="preserve"> PAGEREF _Toc242391855 \h </w:instrText>
+        </w:r>
+        <w:r>
+          <w:rPr>
+            <w:noProof/>
+            <w:webHidden/>
+          </w:rPr>
+        </w:r>
+        <w:r>
+          <w:rPr>
+            <w:noProof/>
+            <w:webHidden/>
+          </w:rPr>
+          <w:fldChar w:fldCharType="separate"/>
+        </w:r>
+        <w:r>
+          <w:rPr>
+            <w:noProof/>
+            <w:webHidden/>
+          </w:rPr>
+          <w:t>11</w:t>
+        </w:r>
+        <w:r>
+          <w:rPr>
+            <w:noProof/>
+            <w:webHidden/>
+          </w:rPr>
+          <w:fldChar w:fldCharType="end"/>
+        </w:r>
+      </w:hyperlink>
+    </w:p>
+    <w:p>
+      <w:pPr>
+        <w:pStyle w:val="TOC2"/>
+        <w:tabs>
+          <w:tab w:val="right" w:leader="dot" w:pos="9679"/>
+        </w:tabs>
+        <w:rPr>
+          <w:rFonts w:asciiTheme="minorHAnsi" w:eastAsiaTheme="minorEastAsia" w:hAnsiTheme="minorHAnsi"/>
+          <w:noProof/>
+          <w:color w:val="auto"/>
+          <w:sz w:val="22"/>
+          <w:lang w:val="ru-RU" w:eastAsia="ru-RU"/>
+        </w:rPr>
+      </w:pPr>
+      <w:hyperlink w:anchor="_Toc242391856" w:history="1">
+        <w:r>
+          <w:rPr>
+            <w:rStyle w:val="Hyperlink"/>
+            <w:rFonts w:eastAsiaTheme="majorEastAsia"/>
+            <w:noProof/>
+          </w:rPr>
+          <w:t>2.2 Разложение времени между приложением и базой данных</w:t>
+        </w:r>
+        <w:r>
+          <w:rPr>
+            <w:noProof/>
+            <w:webHidden/>
+          </w:rPr>
+          <w:tab/>
+        </w:r>
+        <w:r>
+          <w:rPr>
+            <w:noProof/>
+            <w:webHidden/>
+          </w:rPr>
+          <w:fldChar w:fldCharType="begin"/>
+        </w:r>
+        <w:r>
+          <w:rPr>
+            <w:noProof/>
+            <w:webHidden/>
+          </w:rPr>
+          <w:instrText xml:space="preserve"> PAGEREF _Toc242391856 \h </w:instrText>
         </w:r>
         <w:r>
           <w:rPr>
@@ -1112,7 +1039,80 @@
           <w:lang w:val="ru-RU" w:eastAsia="ru-RU"/>
         </w:rPr>
       </w:pPr>
-      <w:hyperlink w:anchor="_Toc242383229" w:history="1">
+      <w:hyperlink w:anchor="_Toc242391857" w:history="1">
+        <w:r>
+          <w:rPr>
+            <w:rStyle w:val="Hyperlink"/>
+            <w:rFonts w:eastAsiaTheme="majorEastAsia"/>
+            <w:noProof/>
+          </w:rPr>
+          <w:t>3 Гипотезы об узких местах</w:t>
+        </w:r>
+        <w:r>
+          <w:rPr>
+            <w:noProof/>
+            <w:webHidden/>
+          </w:rPr>
+          <w:tab/>
+        </w:r>
+        <w:r>
+          <w:rPr>
+            <w:noProof/>
+            <w:webHidden/>
+          </w:rPr>
+          <w:fldChar w:fldCharType="begin"/>
+        </w:r>
+        <w:r>
+          <w:rPr>
+            <w:noProof/>
+            <w:webHidden/>
+          </w:rPr>
+          <w:instrText xml:space="preserve"> PAGEREF _Toc242391857 \h </w:instrText>
+        </w:r>
+        <w:r>
+          <w:rPr>
+            <w:noProof/>
+            <w:webHidden/>
+          </w:rPr>
+        </w:r>
+        <w:r>
+          <w:rPr>
+            <w:noProof/>
+            <w:webHidden/>
+          </w:rPr>
+          <w:fldChar w:fldCharType="separate"/>
+        </w:r>
+        <w:r>
+          <w:rPr>
+            <w:noProof/>
+            <w:webHidden/>
+          </w:rPr>
+          <w:t>13</w:t>
+        </w:r>
+        <w:r>
+          <w:rPr>
+            <w:noProof/>
+            <w:webHidden/>
+          </w:rPr>
+          <w:fldChar w:fldCharType="end"/>
+        </w:r>
+      </w:hyperlink>
+    </w:p>
+    <w:p>
+      <w:pPr>
+        <w:pStyle w:val="TOC1"/>
+        <w:tabs>
+          <w:tab w:val="right" w:leader="dot" w:pos="9679"/>
+        </w:tabs>
+        <w:rPr>
+          <w:rFonts w:asciiTheme="minorHAnsi" w:eastAsiaTheme="minorEastAsia" w:hAnsiTheme="minorHAnsi"/>
+          <w:noProof/>
+          <w:color w:val="auto"/>
+          <w:sz w:val="22"/>
+          <w:lang w:val="ru-RU" w:eastAsia="ru-RU"/>
+        </w:rPr>
+      </w:pPr>
+      <w:hyperlink w:anchor="_Toc242391858" w:history="1">
         <w:r>
           <w:rPr>
             <w:rStyle w:val="Hyperlink"/>
@@ -1140,80 +1140,7 @@
             <w:noProof/>
             <w:webHidden/>
           </w:rPr>
-          <w:instrText xml:space="preserve"> PAGEREF _Toc242383229 \h </w:instrText>
-        </w:r>
-        <w:r>
-          <w:rPr>
-            <w:noProof/>
-            <w:webHidden/>
-          </w:rPr>
-        </w:r>
-        <w:r>
-          <w:rPr>
-            <w:noProof/>
-            <w:webHidden/>
-          </w:rPr>
-          <w:fldChar w:fldCharType="separate"/>
-        </w:r>
-        <w:r>
-          <w:rPr>
-            <w:noProof/>
-            <w:webHidden/>
-          </w:rPr>
-          <w:t>14</w:t>
-        </w:r>
-        <w:r>
-          <w:rPr>
-            <w:noProof/>
-            <w:webHidden/>
-          </w:rPr>
-          <w:fldChar w:fldCharType="end"/>
-        </w:r>
-      </w:hyperlink>
-    </w:p>
-    <w:p>
-      <w:pPr>
-        <w:pStyle w:val="TOC1"/>
-        <w:tabs>
-          <w:tab w:val="right" w:leader="dot" w:pos="9679"/>
-        </w:tabs>
-        <w:rPr>
-          <w:rFonts w:asciiTheme="minorHAnsi" w:eastAsiaTheme="minorEastAsia" w:hAnsiTheme="minorHAnsi"/>
-          <w:noProof/>
-          <w:color w:val="auto"/>
-          <w:sz w:val="22"/>
-          <w:lang w:val="ru-RU" w:eastAsia="ru-RU"/>
-        </w:rPr>
-      </w:pPr>
-      <w:hyperlink w:anchor="_Toc242383230" w:history="1">
-        <w:r>
-          <w:rPr>
-            <w:rStyle w:val="Hyperlink"/>
-            <w:rFonts w:eastAsiaTheme="majorEastAsia"/>
-            <w:noProof/>
-          </w:rPr>
-          <w:t>ПРИЛОЖЕНИЕ А</w:t>
-        </w:r>
-        <w:r>
-          <w:rPr>
-            <w:noProof/>
-            <w:webHidden/>
-          </w:rPr>
-          <w:tab/>
-        </w:r>
-        <w:r>
-          <w:rPr>
-            <w:noProof/>
-            <w:webHidden/>
-          </w:rPr>
-          <w:fldChar w:fldCharType="begin"/>
-        </w:r>
-        <w:r>
-          <w:rPr>
-            <w:noProof/>
-            <w:webHidden/>
-          </w:rPr>
-          <w:instrText xml:space="preserve"> PAGEREF _Toc242383230 \h </w:instrText>
+          <w:instrText xml:space="preserve"> PAGEREF _Toc242391858 \h </w:instrText>
         </w:r>
         <w:r>
           <w:rPr>
@@ -1246,6 +1173,79 @@
     </w:p>
     <w:p>
       <w:pPr>
+        <w:pStyle w:val="TOC1"/>
+        <w:tabs>
+          <w:tab w:val="right" w:leader="dot" w:pos="9679"/>
+        </w:tabs>
+        <w:rPr>
+          <w:rFonts w:asciiTheme="minorHAnsi" w:eastAsiaTheme="minorEastAsia" w:hAnsiTheme="minorHAnsi"/>
+          <w:noProof/>
+          <w:color w:val="auto"/>
+          <w:sz w:val="22"/>
+          <w:lang w:val="ru-RU" w:eastAsia="ru-RU"/>
+        </w:rPr>
+      </w:pPr>
+      <w:hyperlink w:anchor="_Toc242391859" w:history="1">
+        <w:r>
+          <w:rPr>
+            <w:rStyle w:val="Hyperlink"/>
+            <w:rFonts w:eastAsiaTheme="majorEastAsia"/>
+            <w:noProof/>
+          </w:rPr>
+          <w:t>ПРИЛОЖЕНИЕ А</w:t>
+        </w:r>
+        <w:r>
+          <w:rPr>
+            <w:noProof/>
+            <w:webHidden/>
+          </w:rPr>
+          <w:tab/>
+        </w:r>
+        <w:r>
+          <w:rPr>
+            <w:noProof/>
+            <w:webHidden/>
+          </w:rPr>
+          <w:fldChar w:fldCharType="begin"/>
+        </w:r>
+        <w:r>
+          <w:rPr>
+            <w:noProof/>
+            <w:webHidden/>
+          </w:rPr>
+          <w:instrText xml:space="preserve"> PAGEREF _Toc242391859 \h </w:instrText>
+        </w:r>
+        <w:r>
+          <w:rPr>
+            <w:noProof/>
+            <w:webHidden/>
+          </w:rPr>
+        </w:r>
+        <w:r>
+          <w:rPr>
+            <w:noProof/>
+            <w:webHidden/>
+          </w:rPr>
+          <w:fldChar w:fldCharType="separate"/>
+        </w:r>
+        <w:r>
+          <w:rPr>
+            <w:noProof/>
+            <w:webHidden/>
+          </w:rPr>
+          <w:t>16</w:t>
+        </w:r>
+        <w:r>
+          <w:rPr>
+            <w:noProof/>
+            <w:webHidden/>
+          </w:rPr>
+          <w:fldChar w:fldCharType="end"/>
+        </w:r>
+      </w:hyperlink>
+    </w:p>
+    <w:p>
+      <w:pPr>
         <w:ind w:firstLine="0"/>
       </w:pPr>
       <w:r>
@@ -1262,7 +1262,7 @@
         <w:ind w:firstLine="0"/>
         <w:jc w:val="center"/>
       </w:pPr>
-      <w:bookmarkStart w:id="0" w:name="_Toc242383218"/>
+      <w:bookmarkStart w:id="0" w:name="_Toc242391847"/>
       <w:r>
         <w:rPr>
           <w:rFonts w:ascii="Times New Roman" w:hAnsi="Times New Roman"/>
@@ -1759,7 +1759,7 @@
         <w:ind w:firstLine="0"/>
         <w:jc w:val="center"/>
       </w:pPr>
-      <w:bookmarkStart w:id="1" w:name="_Toc242383219"/>
+      <w:bookmarkStart w:id="1" w:name="_Toc242391848"/>
       <w:r>
         <w:rPr>
           <w:rFonts w:ascii="Times New Roman" w:hAnsi="Times New Roman"/>
@@ -1957,7 +1957,7 @@
         <w:ind w:firstLine="709"/>
         <w:jc w:val="left"/>
       </w:pPr>
-      <w:bookmarkStart w:id="2" w:name="_Toc242383220"/>
+      <w:bookmarkStart w:id="2" w:name="_Toc242391849"/>
       <w:r>
         <w:rPr>
           <w:rFonts w:ascii="Times New Roman" w:hAnsi="Times New Roman"/>
@@ -1978,7 +1978,7 @@
         <w:ind w:firstLine="709"/>
         <w:jc w:val="left"/>
       </w:pPr>
-      <w:bookmarkStart w:id="3" w:name="_Toc242383221"/>
+      <w:bookmarkStart w:id="3" w:name="_Toc242391850"/>
       <w:r>
         <w:rPr>
           <w:rFonts w:ascii="Times New Roman" w:hAnsi="Times New Roman"/>
@@ -3086,7 +3086,7 @@
           <w:color w:val="000000"/>
           <w:sz w:val="24"/>
         </w:rPr>
-        <w:t>Все операции, кроме входа, требуют cookie; тело POST — JSON. Даты — YYYY-MM-DD, date_to ≥ date_from; id &gt; 0, page ≥ 1, size от 1 до 100, status — booked/cancelled. ФИО и контакт — 1–200 символов после обрезки пробелов; лишние поля POST дают 422.</w:t>
+        <w:t>Все операции, кроме входа, требуют cookie; тело POST — JSON. Даты — YYYY-MM-DD, date_to ≥ date_from; id &gt; 0, page ≥ 1, size от 1 до 100, status — booked/cancelled. Исходные строки ФИО и контакта должны содержать 1–200 символов. Затем удаляются пробелы по краям и проверяется, что результат не пуст. Дополнительные поля JSON-тела при входе и создании записи дают 422.</w:t>
       </w:r>
     </w:p>
     <w:p>
@@ -3307,7 +3307,7 @@
         <w:ind w:firstLine="709"/>
         <w:jc w:val="left"/>
       </w:pPr>
-      <w:bookmarkStart w:id="4" w:name="_Toc242383222"/>
+      <w:bookmarkStart w:id="4" w:name="_Toc242391851"/>
       <w:r>
         <w:rPr>
           <w:rFonts w:ascii="Times New Roman" w:hAnsi="Times New Roman"/>
@@ -3564,7 +3564,7 @@
         <w:ind w:firstLine="709"/>
         <w:jc w:val="left"/>
       </w:pPr>
-      <w:bookmarkStart w:id="5" w:name="_Toc242383223"/>
+      <w:bookmarkStart w:id="5" w:name="_Toc242391852"/>
       <w:r>
         <w:rPr>
           <w:rFonts w:ascii="Times New Roman" w:hAnsi="Times New Roman"/>
@@ -4150,7 +4150,7 @@
         <w:ind w:firstLine="709"/>
         <w:jc w:val="left"/>
       </w:pPr>
-      <w:bookmarkStart w:id="6" w:name="_Toc242383224"/>
+      <w:bookmarkStart w:id="6" w:name="_Toc242391853"/>
       <w:r>
         <w:rPr>
           <w:rFonts w:ascii="Times New Roman" w:hAnsi="Times New Roman"/>
@@ -4828,7 +4828,7 @@
         <w:ind w:firstLine="709"/>
         <w:jc w:val="left"/>
       </w:pPr>
-      <w:bookmarkStart w:id="7" w:name="_Toc242383225"/>
+      <w:bookmarkStart w:id="7" w:name="_Toc242391854"/>
       <w:r>
         <w:rPr>
           <w:rFonts w:ascii="Times New Roman" w:hAnsi="Times New Roman"/>
@@ -4849,7 +4849,7 @@
         <w:ind w:firstLine="709"/>
         <w:jc w:val="left"/>
       </w:pPr>
-      <w:bookmarkStart w:id="8" w:name="_Toc242383226"/>
+      <w:bookmarkStart w:id="8" w:name="_Toc242391855"/>
       <w:r>
         <w:rPr>
           <w:rFonts w:ascii="Times New Roman" w:hAnsi="Times New Roman"/>
@@ -6929,7 +6929,7 @@
         <w:ind w:firstLine="709"/>
         <w:jc w:val="left"/>
       </w:pPr>
-      <w:bookmarkStart w:id="9" w:name="_Toc242383227"/>
+      <w:bookmarkStart w:id="9" w:name="_Toc242391856"/>
       <w:r>
         <w:rPr>
           <w:rFonts w:ascii="Times New Roman" w:hAnsi="Times New Roman"/>
@@ -8397,7 +8397,7 @@
         <w:ind w:firstLine="709"/>
         <w:jc w:val="left"/>
       </w:pPr>
-      <w:bookmarkStart w:id="10" w:name="_Toc242383228"/>
+      <w:bookmarkStart w:id="10" w:name="_Toc242391857"/>
       <w:r>
         <w:rPr>
           <w:rFonts w:ascii="Times New Roman" w:hAnsi="Times New Roman"/>
@@ -8713,7 +8713,7 @@
         <w:ind w:firstLine="0"/>
         <w:jc w:val="center"/>
       </w:pPr>
-      <w:bookmarkStart w:id="11" w:name="_Toc242383229"/>
+      <w:bookmarkStart w:id="11" w:name="_Toc242391858"/>
       <w:r>
         <w:rPr>
           <w:rFonts w:ascii="Times New Roman" w:hAnsi="Times New Roman"/>
@@ -8911,7 +8911,7 @@
         <w:ind w:firstLine="0"/>
         <w:jc w:val="center"/>
       </w:pPr>
-      <w:bookmarkStart w:id="12" w:name="_Toc242383230"/>
+      <w:bookmarkStart w:id="12" w:name="_Toc242391859"/>
       <w:r>
         <w:rPr>
           <w:rFonts w:ascii="Times New Roman" w:hAnsi="Times New Roman"/>

</xml_diff>